<commit_message>
Fill in execution environment, licences and archiving plan in methods draft
env_alpha100.txt 캡처 결과를 Methods 2.7에 반영하고 [CONFIRM] 세 곳 중
두 곳을 확정했다.

Records the captured environment in Methods 2.7 and resolves two of the
three [CONFIRM] placeholders.

- 2.7: A10G(23,028 MiB), 드라이버 595.91.07, CUDA 13.2, 커널
  7.0.0-1011-aws, Python 3.13.15, torch 2.14.0, transformers 5.16.1,
  peft 0.20.0, bitsandbytes 0.50.2, flwr 1.36.0, datasets 5.0.1,
  numpy 2.5.3, rouge-score 0.1.2, 커밋 7e8a7fa. 첫 번째 환경의 매니페스트는
  인스턴스 종료 전에 캡처하지 못했음을 기록의 한계로 명시.
- 2.1: Dolly-15k는 CC BY-SA 3.0.
- 2.2: Qwen2.5-0.5B-Instruct는 Apache 2.0 — 3B에서 축소한 이유 중 하나가
  더 관대한 라이선스라는 점을 함께 기술.
- Data management: Zenodo DOI 스냅샷(코드 + 로그 48개 4.3MB + 환경
  매니페스트)을 영구 보관하고, 체크포인트 413MB는 재생성 가능하므로
  영구 archive에서 제외한다는 보존 결정을 명시.

Co-Authored-By: Claude Opus 5 <noreply@anthropic.com>
</commit_message>
<xml_diff>
--- a/reports/Week6_Methods_DataManagement_draft.docx
+++ b/reports/Week6_Methods_DataManagement_draft.docx
@@ -19,7 +19,7 @@
           <w:b w:val="0"/>
           <w:sz w:val="20"/>
         </w:rPr>
-        <w:t>Placeholders marked [CONFIRM] require the exact library versions recorded in env_alpha100.txt.</w:t>
+        <w:t>Items marked [CONFIRM] remain to be verified with the mentor.</w:t>
       </w:r>
     </w:p>
     <w:p>
@@ -39,7 +39,7 @@
           <w:b w:val="0"/>
           <w:sz w:val="24"/>
         </w:rPr>
-        <w:t>All experiments used databricks-dolly-15k, an open instruction-following corpus of 15,011 human-written records spanning eight task categories (brainstorming, classification, closed_qa, creative_writing, general_qa, information_extraction, open_qa and summarization). The dataset was obtained from the Hugging Face Hub and was not collected by the author; it is released under CC BY-SA 3.0 [CONFIRM licence statement]. Because the corpus is public and contains no personal data, no ethics approval was required. Before any client partitioning, a global held-out evaluation set was carved out by sampling 10% of each category (1,497 records), leaving 13,514 records for federated training. Holding out per category rather than uniformly ensured that every task type was represented in evaluation even when clients held skewed data. A category-stratified subsample of 200 held-out records was drawn once for generation-based evaluation.</w:t>
+        <w:t>All experiments used databricks-dolly-15k, an open instruction-following corpus of 15,011 human-written records spanning eight task categories (brainstorming, classification, closed_qa, creative_writing, general_qa, information_extraction, open_qa and summarization). The dataset was obtained from the Hugging Face Hub and was not collected by the author; it is released by Databricks under the Creative Commons Attribution-ShareAlike 3.0 licence. Because the corpus is public and contains no personal data, no ethics approval was required. Before any client partitioning, a global held-out evaluation set was carved out by sampling 10% of each category (1,497 records), leaving 13,514 records for federated training. Holding out per category rather than uniformly ensured that every task type was represented in evaluation even when clients held skewed data. A category-stratified subsample of 200 held-out records was drawn once for generation-based evaluation.</w:t>
       </w:r>
     </w:p>
     <w:p>
@@ -59,7 +59,7 @@
           <w:b w:val="0"/>
           <w:sz w:val="24"/>
         </w:rPr>
-        <w:t>The base model was Qwen2.5-0.5B-Instruct, loaded in bfloat16. Fine-tuning used Low-Rank Adaptation (LoRA) with rank r = 8, scaling alpha = 16, dropout 0.05, applied to the q_proj and v_proj projections of all 24 transformer layers. This yielded 540,672 trainable parameters, approximately 0.11% of the model. Three compression levels were compared: an uncompressed baseline with a bfloat16 base model, QLoRA with an 8-bit base model (bitsandbytes LLM.int8(), default outlier threshold), and QLoRA with a 4-bit NF4 base model (bfloat16 compute dtype). In every condition the base model was frozen and only the LoRA adapter was trained and exchanged, and the adapter itself was always kept in fp32. Compression therefore altered client memory and computation but never the quantity of data transmitted.</w:t>
+        <w:t>The base model was Qwen2.5-0.5B-Instruct, loaded in bfloat16. Fine-tuning used Low-Rank Adaptation (LoRA) with rank r = 8, scaling alpha = 16, dropout 0.05, applied to the q_proj and v_proj projections of all 24 transformer layers. This yielded 540,672 trainable parameters, approximately 0.11% of the model. Three compression levels were compared: an uncompressed baseline with a bfloat16 base model, QLoRA with an 8-bit base model (bitsandbytes LLM.int8(), default outlier threshold), and QLoRA with a 4-bit NF4 base model (bfloat16 compute dtype). In every condition the base model was frozen and only the LoRA adapter was trained and exchanged, and the adapter itself was always kept in fp32. Compression therefore altered client memory and computation but never the quantity of data transmitted. The base model is distributed under the Apache 2.0 licence; it was reduced from the originally planned Qwen2.5-3B partly for GPU budget reasons and partly because the 0.5B checkpoint carries this more permissive licence.</w:t>
       </w:r>
     </w:p>
     <w:p>
@@ -159,7 +159,7 @@
           <w:b w:val="0"/>
           <w:sz w:val="24"/>
         </w:rPr>
-        <w:t>Runs were executed on AWS EC2 GPU instances in the ap-northeast-2 region using a single NVIDIA A10G (23 GB). The 18 runs at alpha = 0.1, 1 and 10 were executed in one environment and the six alpha = 100 runs in a later, separately provisioned environment running Python 3.13.15 with [CONFIRM torch, transformers, peft, bitsandbytes, flwr, datasets versions]. The two environments are not identical: 8-bit rounds took 25.5 minutes in the first and 21.6 minutes in the second, indicating a change in the bitsandbytes kernel implementation, while LoRA and 4-bit round times were unchanged. Timing comparisons in this report are therefore restricted to runs from the first environment. All random seeds were fixed at 42. The implementation was verified by an automated test suite of 66 tests covering data preparation, partitioning, adapter wiring, aggregation, checkpointing, convergence and the analysis functions.</w:t>
+        <w:t>Runs were executed on AWS EC2 GPU instances in the ap-northeast-2 region, each using a single NVIDIA A10G (23,028 MiB) under driver 595.91.07 with CUDA 13.2, on Ubuntu with the 7.0.0-1011-aws x86_64 kernel. The 18 runs at alpha = 0.1, 1 and 10 were executed in one environment; the six alpha = 100 runs were executed later in a separately provisioned environment running Python 3.13.15 with torch 2.14.0, transformers 5.16.1, peft 0.20.0, bitsandbytes 0.50.2, flwr 1.36.0, datasets 5.0.1, tokenizers 0.23.2, accelerate 1.14.0, numpy 2.5.3 and rouge-score 0.1.2, at repository commit 7e8a7fa. The complete package manifest for that environment is archived in the repository as env_alpha100.txt. The corresponding manifest for the first environment was not captured before that instance was terminated, which is a limitation of the experimental record. The two environments are known to differ: 8-bit rounds took 25.5 minutes in the first and 21.6 minutes in the second, while LoRA and 4-bit round times were unchanged, a pattern consistent with a change in the bitsandbytes kernel implementation. Timing comparisons in this report are therefore restricted to runs from the first environment. All random seeds were fixed at 42. The implementation was verified by an automated suite of 66 tests covering data preparation, partitioning, adapter wiring, aggregation, checkpointing, convergence and the analysis functions.</w:t>
       </w:r>
     </w:p>
     <w:p>
@@ -179,7 +179,7 @@
           <w:b w:val="0"/>
           <w:sz w:val="24"/>
         </w:rPr>
-        <w:t>All code, configuration, logs and analysis scripts are version-controlled in a single Git repository (github.com/hufs0529/peft_fl_STEM_placement). The repository doubles as the experimental record: each week of the placement is preserved as its own branch (week1 to week6), so the state of the code at every stage is recoverable, and commit messages record the reason for each design change. Experimental outputs are stored as newline-delimited JSON. Each run produces {run_name}_rounds.jsonl, holding one record per round with validation loss, perplexity, round latency, communication bytes, peak GPU memory and, at the final round, ROUGE-L; and {run_name}_generations.jsonl, holding the 200 evaluated instructions with their reference and generated responses and category labels, which allows every generation metric to be recomputed without rerunning the model. Run names encode the full configuration, so a file identifies its own experimental condition. The logs and per-round checkpoints for the 18 original runs are committed on the week4-results branch (413 MB across 129 files) and the alpha = 100 logs on the week5 branch. Analysis and plotting scripts (run_experiment.py, run_alpha100.sh, analyze_interaction.py, plot_results.py) are archived alongside the data, so every figure and table in this report can be regenerated from the committed logs. For long-term preservation the repository will be [CONFIRM: archived to a DOI-issuing repository such as Zenodo / deposited in the Macquarie University research data store], and the raw environment specification captured at run time (env_alpha100.txt) is retained with it.</w:t>
+        <w:t>All code, configuration, logs and analysis scripts are version-controlled in a single Git repository (github.com/hufs0529/peft_fl_STEM_placement). The repository doubles as the experimental record: each week of the placement is preserved as its own branch (week1 to week6), so the state of the code at every stage is recoverable, and commit messages record the reason for each design change. Experimental outputs are stored as newline-delimited JSON. Each run produces {run_name}_rounds.jsonl, holding one record per round with validation loss, perplexity, round latency, communication bytes, peak GPU memory and, at the final round, ROUGE-L; and {run_name}_generations.jsonl, holding the 200 evaluated instructions with their reference and generated responses and category labels, which allows every generation metric to be recomputed without rerunning the model. Run names encode the full configuration, so a file identifies its own experimental condition. The logs and per-round checkpoints for the 18 original runs are committed on the week4-results branch (413 MB across 129 files) and the alpha = 100 logs on the week5 branch. Analysis and plotting scripts (run_experiment.py, run_alpha100.sh, analyze_interaction.py, plot_results.py) are archived alongside the data, so every figure and table in this report can be regenerated from the committed logs. For long-term preservation a tagged snapshot of the repository will be deposited with Zenodo, which mints a persistent DOI for a GitHub release. The deposited archive comprises the source code, the 48 JSONL log files (4.3 MB) and the environment manifests, which together are sufficient to regenerate every figure, table and statistic reported here. The per-round checkpoints (413 MB across 129 files) are retained only for the duration of the placement: they can be regenerated from the archived code and are not required to reproduce any reported result, so they are excluded from the permanent archive. Research data will additionally be retained in accordance with the Macquarie University research data management policy [CONFIRM the university-approved repository and retention period with the mentor].</w:t>
       </w:r>
     </w:p>
     <w:sectPr>

</xml_diff>